<commit_message>
Entry #047: amend ADR-029 (§5) and ADR-046 (§14); F10 retention finding; F7 root cause confirmed; CLAUDE.md Update 003 recorded
Co-Authored-By: Claude Opus 5.5 <noreply@anthropic.com>
</commit_message>
<xml_diff>
--- a/ADR_029.docx
+++ b/ADR_029.docx
@@ -189,7 +189,7 @@
           </w:tcPr>
           <w:p>
             <w:r>
-              <w:t xml:space="preserve">STUB — fragments only, original not recovered</w:t>
+              <w:t xml:space="preserve">STUB — fragments only, original not recovered. AMENDED September 29, 2026 (Entries #045–#047) — see Section 5. The amendments are operator decisions recorded against this stub; if the original is recovered, they carry forward to it.</w:t>
             </w:r>
           </w:p>
         </w:tc>
@@ -426,6 +426,127 @@
       <w:pPr>
         <w:spacing w:before="400"/>
       </w:pPr>
+    </w:p>
+    <w:p>
+      <w:pPr>
+        <w:pStyle w:val="Heading1"/>
+        <w:spacing w:after="140" w:before="280"/>
+      </w:pPr>
+      <w:r>
+        <w:t xml:space="preserve">5.  Amendments — September 29, 2026</w:t>
+      </w:r>
+    </w:p>
+    <w:p>
+      <w:pPr>
+        <w:spacing w:after="120"/>
+      </w:pPr>
+      <w:r>
+        <w:rPr>
+          <w:b/>
+          <w:bCs/>
+        </w:rPr>
+        <w:t xml:space="preserve">5.1  AU-5 — response to audit logging failure (operator decision, Entry #046)</w:t>
+      </w:r>
+    </w:p>
+    <w:p>
+      <w:pPr>
+        <w:spacing w:after="120"/>
+      </w:pPr>
+      <w:r>
+        <w:t xml:space="preserve">An agent_actions write failure must not fail the request, and the operator must not have to review each failure by hand. This replaces the behaviour previously implemented in app/audit.py, where a failed insert raised and took the /agent request down with it.</w:t>
+      </w:r>
+    </w:p>
+    <w:p>
+      <w:pPr>
+        <w:pStyle w:val="ListParagraph"/>
+        <w:numPr>
+          <w:ilvl w:val="0"/>
+          <w:numId w:val="1"/>
+        </w:numPr>
+        <w:spacing w:after="80"/>
+      </w:pPr>
+      <w:r>
+        <w:t xml:space="preserve">write_action() never raises. A failed insert is appended to a JSONL spool on the host (~/openclaw/spool/audit_spool.jsonl, mounted into the container so it survives rebuilds; excluded from Git) and logged once at ERROR.</w:t>
+      </w:r>
+    </w:p>
+    <w:p>
+      <w:pPr>
+        <w:pStyle w:val="ListParagraph"/>
+        <w:numPr>
+          <w:ilvl w:val="0"/>
+          <w:numId w:val="1"/>
+        </w:numPr>
+        <w:spacing w:after="80"/>
+      </w:pPr>
+      <w:r>
+        <w:t xml:space="preserve">The next successful write replays the spool automatically. Inserts use ON CONFLICT (action_id, created_at) DO NOTHING, so a record can never be written twice.</w:t>
+      </w:r>
+    </w:p>
+    <w:p>
+      <w:pPr>
+        <w:pStyle w:val="ListParagraph"/>
+        <w:numPr>
+          <w:ilvl w:val="0"/>
+          <w:numId w:val="1"/>
+        </w:numPr>
+        <w:spacing w:after="80"/>
+      </w:pPr>
+      <w:r>
+        <w:t xml:space="preserve">A record is lost only if both the database and the spool fail; that is logged at CRITICAL. Spool growth is the escalation signal, checked at session start — not a manual review queue.</w:t>
+      </w:r>
+    </w:p>
+    <w:p>
+      <w:pPr>
+        <w:pStyle w:val="ListParagraph"/>
+        <w:numPr>
+          <w:ilvl w:val="0"/>
+          <w:numId w:val="1"/>
+        </w:numPr>
+        <w:spacing w:after="80"/>
+      </w:pPr>
+      <w:r>
+        <w:t xml:space="preserve">Rationale: availability with automatic recovery, rather than completeness by blocking. The “one audit row per request” intent is preserved; only the timing of the write can be deferred.</w:t>
+      </w:r>
+    </w:p>
+    <w:p>
+      <w:pPr>
+        <w:spacing w:after="120"/>
+      </w:pPr>
+      <w:r>
+        <w:rPr>
+          <w:b/>
+          <w:bCs/>
+        </w:rPr>
+        <w:t xml:space="preserve">5.2  Partitions (Entry #045 — ADR-046 F7)</w:t>
+      </w:r>
+    </w:p>
+    <w:p>
+      <w:pPr>
+        <w:spacing w:after="120"/>
+      </w:pPr>
+      <w:r>
+        <w:t xml:space="preserve">The live table held monthly partitions for April–July 2026 only, with no DEFAULT partition. From August 1, 2026 every insert failed. migration_007.sql (schema version 7 → 8) added monthly partitions through December 2027 and a DEFAULT partition. Root cause, confirmed from ADR-035 §9: partitions were to be “created monthly by the nightly maintenance job”, and that job was never built.</w:t>
+      </w:r>
+    </w:p>
+    <w:p>
+      <w:pPr>
+        <w:spacing w:after="120"/>
+      </w:pPr>
+      <w:r>
+        <w:rPr>
+          <w:b/>
+          <w:bCs/>
+        </w:rPr>
+        <w:t xml:space="preserve">5.3  Finding — 90-day retention not enforced (Entry #047)</w:t>
+      </w:r>
+    </w:p>
+    <w:p>
+      <w:pPr>
+        <w:spacing w:after="120"/>
+      </w:pPr>
+      <w:r>
+        <w:t xml:space="preserve">Section 2 records a 90-day retention policy; ADR-035 §9.4 implements it as a monthly DROP PARTITION “run monthly by cron under dev account”. No such job exists on this host, and the dev account does not exist (ADR-046 F5). Rows from April and May 2026 remain in agent_actions beyond 90 days. Severity LOW: over-retention of local audit records, no loss of evidence. Remediation — a scheduled maintenance job that drops expired partitions and creates the next ones — is pending operator approval, and must first check agent_actions_default for rows in any range it is about to create.</w:t>
+      </w:r>
     </w:p>
     <w:p>
       <w:pPr>

</xml_diff>